<commit_message>
docs(requirements): add chapter 1 user stories document
</commit_message>
<xml_diff>
--- a/docs/User-Stories.docx
+++ b/docs/User-Stories.docx
@@ -148,6 +148,7 @@
           <w:rFonts w:ascii="Times New Roman" w:hAnsi="Times New Roman" w:cs="Times New Roman"/>
           <w:sz w:val="26"/>
           <w:szCs w:val="26"/>
+          <w:lang w:val="vi-VN"/>
         </w:rPr>
       </w:pPr>
       <w:r>
@@ -155,6 +156,7 @@
           <w:rFonts w:ascii="Cambria Math" w:hAnsi="Cambria Math" w:cs="Cambria Math"/>
           <w:sz w:val="26"/>
           <w:szCs w:val="26"/>
+          <w:lang w:val="vi-VN"/>
         </w:rPr>
         <w:t>①</w:t>
       </w:r>
@@ -163,140 +165,56 @@
           <w:rFonts w:ascii="Times New Roman" w:hAnsi="Times New Roman" w:cs="Times New Roman"/>
           <w:sz w:val="26"/>
           <w:szCs w:val="26"/>
-        </w:rPr>
-        <w:t xml:space="preserve"> </w:t>
-      </w:r>
-      <w:proofErr w:type="spellStart"/>
-      <w:r>
-        <w:rPr>
-          <w:rFonts w:ascii="Times New Roman" w:hAnsi="Times New Roman" w:cs="Times New Roman"/>
-          <w:sz w:val="26"/>
-          <w:szCs w:val="26"/>
-        </w:rPr>
-        <w:t>Phiếu</w:t>
-      </w:r>
-      <w:proofErr w:type="spellEnd"/>
-      <w:r>
-        <w:rPr>
-          <w:rFonts w:ascii="Times New Roman" w:hAnsi="Times New Roman" w:cs="Times New Roman"/>
-          <w:sz w:val="26"/>
-          <w:szCs w:val="26"/>
-        </w:rPr>
-        <w:t xml:space="preserve"> </w:t>
-      </w:r>
-      <w:proofErr w:type="spellStart"/>
-      <w:r>
-        <w:rPr>
-          <w:rFonts w:ascii="Times New Roman" w:hAnsi="Times New Roman" w:cs="Times New Roman"/>
-          <w:sz w:val="26"/>
-          <w:szCs w:val="26"/>
-        </w:rPr>
-        <w:t>đăng</w:t>
-      </w:r>
-      <w:proofErr w:type="spellEnd"/>
-      <w:r>
-        <w:rPr>
-          <w:rFonts w:ascii="Times New Roman" w:hAnsi="Times New Roman" w:cs="Times New Roman"/>
-          <w:sz w:val="26"/>
-          <w:szCs w:val="26"/>
-        </w:rPr>
-        <w:t xml:space="preserve"> </w:t>
-      </w:r>
-      <w:proofErr w:type="spellStart"/>
-      <w:r>
-        <w:rPr>
-          <w:rFonts w:ascii="Times New Roman" w:hAnsi="Times New Roman" w:cs="Times New Roman"/>
-          <w:sz w:val="26"/>
-          <w:szCs w:val="26"/>
-        </w:rPr>
-        <w:t>ký</w:t>
-      </w:r>
-      <w:proofErr w:type="spellEnd"/>
-      <w:r>
-        <w:rPr>
-          <w:rFonts w:ascii="Times New Roman" w:hAnsi="Times New Roman" w:cs="Times New Roman"/>
-          <w:sz w:val="26"/>
-          <w:szCs w:val="26"/>
-        </w:rPr>
-        <w:t xml:space="preserve"> </w:t>
-      </w:r>
-      <w:proofErr w:type="spellStart"/>
-      <w:r>
-        <w:rPr>
-          <w:rFonts w:ascii="Times New Roman" w:hAnsi="Times New Roman" w:cs="Times New Roman"/>
-          <w:sz w:val="26"/>
-          <w:szCs w:val="26"/>
-        </w:rPr>
-        <w:t>đang</w:t>
-      </w:r>
-      <w:proofErr w:type="spellEnd"/>
-      <w:r>
-        <w:rPr>
-          <w:rFonts w:ascii="Times New Roman" w:hAnsi="Times New Roman" w:cs="Times New Roman"/>
-          <w:sz w:val="26"/>
-          <w:szCs w:val="26"/>
-        </w:rPr>
-        <w:t xml:space="preserve"> ở </w:t>
-      </w:r>
-      <w:proofErr w:type="spellStart"/>
-      <w:r>
-        <w:rPr>
-          <w:rFonts w:ascii="Times New Roman" w:hAnsi="Times New Roman" w:cs="Times New Roman"/>
-          <w:sz w:val="26"/>
-          <w:szCs w:val="26"/>
-        </w:rPr>
-        <w:t>trạng</w:t>
-      </w:r>
-      <w:proofErr w:type="spellEnd"/>
-      <w:r>
-        <w:rPr>
-          <w:rFonts w:ascii="Times New Roman" w:hAnsi="Times New Roman" w:cs="Times New Roman"/>
-          <w:sz w:val="26"/>
-          <w:szCs w:val="26"/>
-        </w:rPr>
-        <w:t xml:space="preserve"> </w:t>
-      </w:r>
-      <w:proofErr w:type="spellStart"/>
-      <w:r>
-        <w:rPr>
-          <w:rFonts w:ascii="Times New Roman" w:hAnsi="Times New Roman" w:cs="Times New Roman"/>
-          <w:sz w:val="26"/>
-          <w:szCs w:val="26"/>
-        </w:rPr>
-        <w:t>thái</w:t>
-      </w:r>
-      <w:proofErr w:type="spellEnd"/>
-      <w:r>
-        <w:rPr>
-          <w:rFonts w:ascii="Times New Roman" w:hAnsi="Times New Roman" w:cs="Times New Roman"/>
-          <w:sz w:val="26"/>
-          <w:szCs w:val="26"/>
-        </w:rPr>
-        <w:t xml:space="preserve"> Pending </w:t>
-      </w:r>
-      <w:proofErr w:type="spellStart"/>
-      <w:r>
-        <w:rPr>
-          <w:rFonts w:ascii="Times New Roman" w:hAnsi="Times New Roman" w:cs="Times New Roman"/>
-          <w:sz w:val="26"/>
-          <w:szCs w:val="26"/>
-        </w:rPr>
-        <w:t>hoặc</w:t>
-      </w:r>
-      <w:proofErr w:type="spellEnd"/>
-      <w:r>
-        <w:rPr>
-          <w:rFonts w:ascii="Times New Roman" w:hAnsi="Times New Roman" w:cs="Times New Roman"/>
-          <w:sz w:val="26"/>
-          <w:szCs w:val="26"/>
-        </w:rPr>
-        <w:t xml:space="preserve"> Confirmed </w:t>
+          <w:lang w:val="vi-VN"/>
+        </w:rPr>
+        <w:t xml:space="preserve"> Phiếu đăng ký đang ở trạng thái </w:t>
+      </w:r>
+      <w:proofErr w:type="spellStart"/>
+      <w:r>
+        <w:rPr>
+          <w:rFonts w:ascii="Times New Roman" w:hAnsi="Times New Roman" w:cs="Times New Roman"/>
+          <w:sz w:val="26"/>
+          <w:szCs w:val="26"/>
+          <w:lang w:val="vi-VN"/>
+        </w:rPr>
+        <w:t>Pending</w:t>
+      </w:r>
+      <w:proofErr w:type="spellEnd"/>
+      <w:r>
+        <w:rPr>
+          <w:rFonts w:ascii="Times New Roman" w:hAnsi="Times New Roman" w:cs="Times New Roman"/>
+          <w:sz w:val="26"/>
+          <w:szCs w:val="26"/>
+          <w:lang w:val="vi-VN"/>
+        </w:rPr>
+        <w:t xml:space="preserve"> hoặc </w:t>
+      </w:r>
+      <w:proofErr w:type="spellStart"/>
+      <w:r>
+        <w:rPr>
+          <w:rFonts w:ascii="Times New Roman" w:hAnsi="Times New Roman" w:cs="Times New Roman"/>
+          <w:sz w:val="26"/>
+          <w:szCs w:val="26"/>
+          <w:lang w:val="vi-VN"/>
+        </w:rPr>
+        <w:t>Confirmed</w:t>
+      </w:r>
+      <w:proofErr w:type="spellEnd"/>
+      <w:r>
+        <w:rPr>
+          <w:rFonts w:ascii="Times New Roman" w:hAnsi="Times New Roman" w:cs="Times New Roman"/>
+          <w:sz w:val="26"/>
+          <w:szCs w:val="26"/>
+          <w:lang w:val="vi-VN"/>
+        </w:rPr>
+        <w:t xml:space="preserve"> </w:t>
       </w:r>
       <w:r>
         <w:rPr>
           <w:rFonts w:ascii="Segoe UI Symbol" w:hAnsi="Segoe UI Symbol" w:cs="Segoe UI Symbol"/>
           <w:sz w:val="26"/>
           <w:szCs w:val="26"/>
+          <w:lang w:val="vi-VN"/>
         </w:rPr>
         <w:t>➔</w:t>
       </w:r>
@@ -305,68 +223,16 @@
           <w:rFonts w:ascii="Times New Roman" w:hAnsi="Times New Roman" w:cs="Times New Roman"/>
           <w:sz w:val="26"/>
           <w:szCs w:val="26"/>
-        </w:rPr>
-        <w:t xml:space="preserve"> </w:t>
-      </w:r>
-      <w:proofErr w:type="spellStart"/>
-      <w:r>
-        <w:rPr>
-          <w:rFonts w:ascii="Times New Roman" w:hAnsi="Times New Roman" w:cs="Times New Roman"/>
-          <w:sz w:val="26"/>
-          <w:szCs w:val="26"/>
-        </w:rPr>
-        <w:t>hủy</w:t>
-      </w:r>
-      <w:proofErr w:type="spellEnd"/>
-      <w:r>
-        <w:rPr>
-          <w:rFonts w:ascii="Times New Roman" w:hAnsi="Times New Roman" w:cs="Times New Roman"/>
-          <w:sz w:val="26"/>
-          <w:szCs w:val="26"/>
-        </w:rPr>
-        <w:t xml:space="preserve"> </w:t>
-      </w:r>
-      <w:proofErr w:type="spellStart"/>
-      <w:r>
-        <w:rPr>
-          <w:rFonts w:ascii="Times New Roman" w:hAnsi="Times New Roman" w:cs="Times New Roman"/>
-          <w:sz w:val="26"/>
-          <w:szCs w:val="26"/>
-        </w:rPr>
-        <w:t>đăng</w:t>
-      </w:r>
-      <w:proofErr w:type="spellEnd"/>
-      <w:r>
-        <w:rPr>
-          <w:rFonts w:ascii="Times New Roman" w:hAnsi="Times New Roman" w:cs="Times New Roman"/>
-          <w:sz w:val="26"/>
-          <w:szCs w:val="26"/>
-        </w:rPr>
-        <w:t xml:space="preserve"> </w:t>
-      </w:r>
-      <w:proofErr w:type="spellStart"/>
-      <w:r>
-        <w:rPr>
-          <w:rFonts w:ascii="Times New Roman" w:hAnsi="Times New Roman" w:cs="Times New Roman"/>
-          <w:sz w:val="26"/>
-          <w:szCs w:val="26"/>
-        </w:rPr>
-        <w:t>ký</w:t>
-      </w:r>
-      <w:proofErr w:type="spellEnd"/>
-      <w:r>
-        <w:rPr>
-          <w:rFonts w:ascii="Times New Roman" w:hAnsi="Times New Roman" w:cs="Times New Roman"/>
-          <w:sz w:val="26"/>
-          <w:szCs w:val="26"/>
-        </w:rPr>
-        <w:t xml:space="preserve"> </w:t>
+          <w:lang w:val="vi-VN"/>
+        </w:rPr>
+        <w:t xml:space="preserve"> hủy đăng ký </w:t>
       </w:r>
       <w:r>
         <w:rPr>
           <w:rFonts w:ascii="Segoe UI Symbol" w:hAnsi="Segoe UI Symbol" w:cs="Segoe UI Symbol"/>
           <w:sz w:val="26"/>
           <w:szCs w:val="26"/>
+          <w:lang w:val="vi-VN"/>
         </w:rPr>
         <w:t>➔</w:t>
       </w:r>
@@ -375,163 +241,30 @@
           <w:rFonts w:ascii="Times New Roman" w:hAnsi="Times New Roman" w:cs="Times New Roman"/>
           <w:sz w:val="26"/>
           <w:szCs w:val="26"/>
-        </w:rPr>
-        <w:t xml:space="preserve"> </w:t>
-      </w:r>
-      <w:proofErr w:type="spellStart"/>
-      <w:r>
-        <w:rPr>
-          <w:rFonts w:ascii="Times New Roman" w:hAnsi="Times New Roman" w:cs="Times New Roman"/>
-          <w:sz w:val="26"/>
-          <w:szCs w:val="26"/>
-        </w:rPr>
-        <w:t>trạng</w:t>
-      </w:r>
-      <w:proofErr w:type="spellEnd"/>
-      <w:r>
-        <w:rPr>
-          <w:rFonts w:ascii="Times New Roman" w:hAnsi="Times New Roman" w:cs="Times New Roman"/>
-          <w:sz w:val="26"/>
-          <w:szCs w:val="26"/>
-        </w:rPr>
-        <w:t xml:space="preserve"> </w:t>
-      </w:r>
-      <w:proofErr w:type="spellStart"/>
-      <w:r>
-        <w:rPr>
-          <w:rFonts w:ascii="Times New Roman" w:hAnsi="Times New Roman" w:cs="Times New Roman"/>
-          <w:sz w:val="26"/>
-          <w:szCs w:val="26"/>
-        </w:rPr>
-        <w:t>thái</w:t>
-      </w:r>
-      <w:proofErr w:type="spellEnd"/>
-      <w:r>
-        <w:rPr>
-          <w:rFonts w:ascii="Times New Roman" w:hAnsi="Times New Roman" w:cs="Times New Roman"/>
-          <w:sz w:val="26"/>
-          <w:szCs w:val="26"/>
-        </w:rPr>
-        <w:t xml:space="preserve"> </w:t>
-      </w:r>
-      <w:proofErr w:type="spellStart"/>
-      <w:r>
-        <w:rPr>
-          <w:rFonts w:ascii="Times New Roman" w:hAnsi="Times New Roman" w:cs="Times New Roman"/>
-          <w:sz w:val="26"/>
-          <w:szCs w:val="26"/>
-        </w:rPr>
-        <w:t>đổi</w:t>
-      </w:r>
-      <w:proofErr w:type="spellEnd"/>
-      <w:r>
-        <w:rPr>
-          <w:rFonts w:ascii="Times New Roman" w:hAnsi="Times New Roman" w:cs="Times New Roman"/>
-          <w:sz w:val="26"/>
-          <w:szCs w:val="26"/>
-        </w:rPr>
-        <w:t xml:space="preserve"> </w:t>
-      </w:r>
-      <w:proofErr w:type="spellStart"/>
-      <w:r>
-        <w:rPr>
-          <w:rFonts w:ascii="Times New Roman" w:hAnsi="Times New Roman" w:cs="Times New Roman"/>
-          <w:sz w:val="26"/>
-          <w:szCs w:val="26"/>
-        </w:rPr>
-        <w:t>thành</w:t>
-      </w:r>
-      <w:proofErr w:type="spellEnd"/>
-      <w:r>
-        <w:rPr>
-          <w:rFonts w:ascii="Times New Roman" w:hAnsi="Times New Roman" w:cs="Times New Roman"/>
-          <w:sz w:val="26"/>
-          <w:szCs w:val="26"/>
-        </w:rPr>
-        <w:t xml:space="preserve"> Cancelled </w:t>
-      </w:r>
-      <w:proofErr w:type="spellStart"/>
-      <w:r>
-        <w:rPr>
-          <w:rFonts w:ascii="Times New Roman" w:hAnsi="Times New Roman" w:cs="Times New Roman"/>
-          <w:sz w:val="26"/>
-          <w:szCs w:val="26"/>
-        </w:rPr>
-        <w:t>và</w:t>
-      </w:r>
-      <w:proofErr w:type="spellEnd"/>
-      <w:r>
-        <w:rPr>
-          <w:rFonts w:ascii="Times New Roman" w:hAnsi="Times New Roman" w:cs="Times New Roman"/>
-          <w:sz w:val="26"/>
-          <w:szCs w:val="26"/>
-        </w:rPr>
-        <w:t xml:space="preserve"> </w:t>
-      </w:r>
-      <w:proofErr w:type="spellStart"/>
-      <w:r>
-        <w:rPr>
-          <w:rFonts w:ascii="Times New Roman" w:hAnsi="Times New Roman" w:cs="Times New Roman"/>
-          <w:sz w:val="26"/>
-          <w:szCs w:val="26"/>
-        </w:rPr>
-        <w:t>hoàn</w:t>
-      </w:r>
-      <w:proofErr w:type="spellEnd"/>
-      <w:r>
-        <w:rPr>
-          <w:rFonts w:ascii="Times New Roman" w:hAnsi="Times New Roman" w:cs="Times New Roman"/>
-          <w:sz w:val="26"/>
-          <w:szCs w:val="26"/>
-        </w:rPr>
-        <w:t xml:space="preserve"> </w:t>
-      </w:r>
-      <w:proofErr w:type="spellStart"/>
-      <w:r>
-        <w:rPr>
-          <w:rFonts w:ascii="Times New Roman" w:hAnsi="Times New Roman" w:cs="Times New Roman"/>
-          <w:sz w:val="26"/>
-          <w:szCs w:val="26"/>
-        </w:rPr>
-        <w:t>lại</w:t>
-      </w:r>
-      <w:proofErr w:type="spellEnd"/>
-      <w:r>
-        <w:rPr>
-          <w:rFonts w:ascii="Times New Roman" w:hAnsi="Times New Roman" w:cs="Times New Roman"/>
-          <w:sz w:val="26"/>
-          <w:szCs w:val="26"/>
-        </w:rPr>
-        <w:t xml:space="preserve"> </w:t>
-      </w:r>
-      <w:proofErr w:type="spellStart"/>
-      <w:r>
-        <w:rPr>
-          <w:rFonts w:ascii="Times New Roman" w:hAnsi="Times New Roman" w:cs="Times New Roman"/>
-          <w:sz w:val="26"/>
-          <w:szCs w:val="26"/>
-        </w:rPr>
-        <w:t>chỗ</w:t>
-      </w:r>
-      <w:proofErr w:type="spellEnd"/>
-      <w:r>
-        <w:rPr>
-          <w:rFonts w:ascii="Times New Roman" w:hAnsi="Times New Roman" w:cs="Times New Roman"/>
-          <w:sz w:val="26"/>
-          <w:szCs w:val="26"/>
-        </w:rPr>
-        <w:t xml:space="preserve"> </w:t>
-      </w:r>
-      <w:proofErr w:type="spellStart"/>
-      <w:r>
-        <w:rPr>
-          <w:rFonts w:ascii="Times New Roman" w:hAnsi="Times New Roman" w:cs="Times New Roman"/>
-          <w:sz w:val="26"/>
-          <w:szCs w:val="26"/>
-        </w:rPr>
-        <w:t>trống</w:t>
-      </w:r>
-      <w:proofErr w:type="spellEnd"/>
+          <w:lang w:val="vi-VN"/>
+        </w:rPr>
+        <w:t xml:space="preserve"> trạng thái đổi thành </w:t>
+      </w:r>
+      <w:proofErr w:type="spellStart"/>
+      <w:r>
+        <w:rPr>
+          <w:rFonts w:ascii="Times New Roman" w:hAnsi="Times New Roman" w:cs="Times New Roman"/>
+          <w:sz w:val="26"/>
+          <w:szCs w:val="26"/>
+          <w:lang w:val="vi-VN"/>
+        </w:rPr>
+        <w:t>Cancelled</w:t>
+      </w:r>
+      <w:proofErr w:type="spellEnd"/>
+      <w:r>
+        <w:rPr>
+          <w:rFonts w:ascii="Times New Roman" w:hAnsi="Times New Roman" w:cs="Times New Roman"/>
+          <w:sz w:val="26"/>
+          <w:szCs w:val="26"/>
+          <w:lang w:val="vi-VN"/>
+        </w:rPr>
+        <w:t xml:space="preserve"> và hoàn lại chỗ trống</w:t>
+      </w:r>
     </w:p>
     <w:p>
       <w:pPr>
@@ -548,6 +281,7 @@
           <w:rFonts w:ascii="Cambria Math" w:hAnsi="Cambria Math" w:cs="Cambria Math"/>
           <w:sz w:val="26"/>
           <w:szCs w:val="26"/>
+          <w:lang w:val="vi-VN"/>
         </w:rPr>
         <w:t>②</w:t>
       </w:r>
@@ -556,86 +290,36 @@
           <w:rFonts w:ascii="Times New Roman" w:hAnsi="Times New Roman" w:cs="Times New Roman"/>
           <w:sz w:val="26"/>
           <w:szCs w:val="26"/>
-        </w:rPr>
-        <w:t xml:space="preserve"> </w:t>
-      </w:r>
-      <w:proofErr w:type="spellStart"/>
-      <w:r>
-        <w:rPr>
-          <w:rFonts w:ascii="Times New Roman" w:hAnsi="Times New Roman" w:cs="Times New Roman"/>
-          <w:sz w:val="26"/>
-          <w:szCs w:val="26"/>
-        </w:rPr>
-        <w:t>Phiếu</w:t>
-      </w:r>
-      <w:proofErr w:type="spellEnd"/>
-      <w:r>
-        <w:rPr>
-          <w:rFonts w:ascii="Times New Roman" w:hAnsi="Times New Roman" w:cs="Times New Roman"/>
-          <w:sz w:val="26"/>
-          <w:szCs w:val="26"/>
-        </w:rPr>
-        <w:t xml:space="preserve"> </w:t>
-      </w:r>
-      <w:proofErr w:type="spellStart"/>
-      <w:r>
-        <w:rPr>
-          <w:rFonts w:ascii="Times New Roman" w:hAnsi="Times New Roman" w:cs="Times New Roman"/>
-          <w:sz w:val="26"/>
-          <w:szCs w:val="26"/>
-        </w:rPr>
-        <w:t>đăng</w:t>
-      </w:r>
-      <w:proofErr w:type="spellEnd"/>
-      <w:r>
-        <w:rPr>
-          <w:rFonts w:ascii="Times New Roman" w:hAnsi="Times New Roman" w:cs="Times New Roman"/>
-          <w:sz w:val="26"/>
-          <w:szCs w:val="26"/>
-        </w:rPr>
-        <w:t xml:space="preserve"> </w:t>
-      </w:r>
-      <w:proofErr w:type="spellStart"/>
-      <w:r>
-        <w:rPr>
-          <w:rFonts w:ascii="Times New Roman" w:hAnsi="Times New Roman" w:cs="Times New Roman"/>
-          <w:sz w:val="26"/>
-          <w:szCs w:val="26"/>
-        </w:rPr>
-        <w:t>ký</w:t>
-      </w:r>
-      <w:proofErr w:type="spellEnd"/>
-      <w:r>
-        <w:rPr>
-          <w:rFonts w:ascii="Times New Roman" w:hAnsi="Times New Roman" w:cs="Times New Roman"/>
-          <w:sz w:val="26"/>
-          <w:szCs w:val="26"/>
-        </w:rPr>
-        <w:t xml:space="preserve"> </w:t>
-      </w:r>
-      <w:proofErr w:type="spellStart"/>
-      <w:r>
-        <w:rPr>
-          <w:rFonts w:ascii="Times New Roman" w:hAnsi="Times New Roman" w:cs="Times New Roman"/>
-          <w:sz w:val="26"/>
-          <w:szCs w:val="26"/>
-        </w:rPr>
-        <w:t>đã</w:t>
-      </w:r>
-      <w:proofErr w:type="spellEnd"/>
-      <w:r>
-        <w:rPr>
-          <w:rFonts w:ascii="Times New Roman" w:hAnsi="Times New Roman" w:cs="Times New Roman"/>
-          <w:sz w:val="26"/>
-          <w:szCs w:val="26"/>
-        </w:rPr>
-        <w:t xml:space="preserve"> Cancelled </w:t>
+          <w:lang w:val="vi-VN"/>
+        </w:rPr>
+        <w:t xml:space="preserve"> Phiếu đăng ký đã </w:t>
+      </w:r>
+      <w:proofErr w:type="spellStart"/>
+      <w:r>
+        <w:rPr>
+          <w:rFonts w:ascii="Times New Roman" w:hAnsi="Times New Roman" w:cs="Times New Roman"/>
+          <w:sz w:val="26"/>
+          <w:szCs w:val="26"/>
+          <w:lang w:val="vi-VN"/>
+        </w:rPr>
+        <w:t>Cancelled</w:t>
+      </w:r>
+      <w:proofErr w:type="spellEnd"/>
+      <w:r>
+        <w:rPr>
+          <w:rFonts w:ascii="Times New Roman" w:hAnsi="Times New Roman" w:cs="Times New Roman"/>
+          <w:sz w:val="26"/>
+          <w:szCs w:val="26"/>
+          <w:lang w:val="vi-VN"/>
+        </w:rPr>
+        <w:t xml:space="preserve"> </w:t>
       </w:r>
       <w:r>
         <w:rPr>
           <w:rFonts w:ascii="Segoe UI Symbol" w:hAnsi="Segoe UI Symbol" w:cs="Segoe UI Symbol"/>
           <w:sz w:val="26"/>
           <w:szCs w:val="26"/>
+          <w:lang w:val="vi-VN"/>
         </w:rPr>
         <w:t>➔</w:t>
       </w:r>
@@ -644,122 +328,16 @@
           <w:rFonts w:ascii="Times New Roman" w:hAnsi="Times New Roman" w:cs="Times New Roman"/>
           <w:sz w:val="26"/>
           <w:szCs w:val="26"/>
-        </w:rPr>
-        <w:t xml:space="preserve"> </w:t>
-      </w:r>
-      <w:proofErr w:type="spellStart"/>
-      <w:r>
-        <w:rPr>
-          <w:rFonts w:ascii="Times New Roman" w:hAnsi="Times New Roman" w:cs="Times New Roman"/>
-          <w:sz w:val="26"/>
-          <w:szCs w:val="26"/>
-        </w:rPr>
-        <w:t>bấm</w:t>
-      </w:r>
-      <w:proofErr w:type="spellEnd"/>
-      <w:r>
-        <w:rPr>
-          <w:rFonts w:ascii="Times New Roman" w:hAnsi="Times New Roman" w:cs="Times New Roman"/>
-          <w:sz w:val="26"/>
-          <w:szCs w:val="26"/>
-        </w:rPr>
-        <w:t xml:space="preserve"> </w:t>
-      </w:r>
-      <w:proofErr w:type="spellStart"/>
-      <w:r>
-        <w:rPr>
-          <w:rFonts w:ascii="Times New Roman" w:hAnsi="Times New Roman" w:cs="Times New Roman"/>
-          <w:sz w:val="26"/>
-          <w:szCs w:val="26"/>
-        </w:rPr>
-        <w:t>hủy</w:t>
-      </w:r>
-      <w:proofErr w:type="spellEnd"/>
-      <w:r>
-        <w:rPr>
-          <w:rFonts w:ascii="Times New Roman" w:hAnsi="Times New Roman" w:cs="Times New Roman"/>
-          <w:sz w:val="26"/>
-          <w:szCs w:val="26"/>
-        </w:rPr>
-        <w:t xml:space="preserve"> </w:t>
-      </w:r>
-      <w:proofErr w:type="spellStart"/>
-      <w:r>
-        <w:rPr>
-          <w:rFonts w:ascii="Times New Roman" w:hAnsi="Times New Roman" w:cs="Times New Roman"/>
-          <w:sz w:val="26"/>
-          <w:szCs w:val="26"/>
-        </w:rPr>
-        <w:t>đăng</w:t>
-      </w:r>
-      <w:proofErr w:type="spellEnd"/>
-      <w:r>
-        <w:rPr>
-          <w:rFonts w:ascii="Times New Roman" w:hAnsi="Times New Roman" w:cs="Times New Roman"/>
-          <w:sz w:val="26"/>
-          <w:szCs w:val="26"/>
-        </w:rPr>
-        <w:t xml:space="preserve"> </w:t>
-      </w:r>
-      <w:proofErr w:type="spellStart"/>
-      <w:r>
-        <w:rPr>
-          <w:rFonts w:ascii="Times New Roman" w:hAnsi="Times New Roman" w:cs="Times New Roman"/>
-          <w:sz w:val="26"/>
-          <w:szCs w:val="26"/>
-        </w:rPr>
-        <w:t>ký</w:t>
-      </w:r>
-      <w:proofErr w:type="spellEnd"/>
-      <w:r>
-        <w:rPr>
-          <w:rFonts w:ascii="Times New Roman" w:hAnsi="Times New Roman" w:cs="Times New Roman"/>
-          <w:sz w:val="26"/>
-          <w:szCs w:val="26"/>
-        </w:rPr>
-        <w:t xml:space="preserve"> </w:t>
-      </w:r>
-      <w:proofErr w:type="spellStart"/>
-      <w:r>
-        <w:rPr>
-          <w:rFonts w:ascii="Times New Roman" w:hAnsi="Times New Roman" w:cs="Times New Roman"/>
-          <w:sz w:val="26"/>
-          <w:szCs w:val="26"/>
-        </w:rPr>
-        <w:t>lần</w:t>
-      </w:r>
-      <w:proofErr w:type="spellEnd"/>
-      <w:r>
-        <w:rPr>
-          <w:rFonts w:ascii="Times New Roman" w:hAnsi="Times New Roman" w:cs="Times New Roman"/>
-          <w:sz w:val="26"/>
-          <w:szCs w:val="26"/>
-        </w:rPr>
-        <w:t xml:space="preserve"> </w:t>
-      </w:r>
-      <w:proofErr w:type="spellStart"/>
-      <w:r>
-        <w:rPr>
-          <w:rFonts w:ascii="Times New Roman" w:hAnsi="Times New Roman" w:cs="Times New Roman"/>
-          <w:sz w:val="26"/>
-          <w:szCs w:val="26"/>
-        </w:rPr>
-        <w:t>nữa</w:t>
-      </w:r>
-      <w:proofErr w:type="spellEnd"/>
-      <w:r>
-        <w:rPr>
-          <w:rFonts w:ascii="Times New Roman" w:hAnsi="Times New Roman" w:cs="Times New Roman"/>
-          <w:sz w:val="26"/>
-          <w:szCs w:val="26"/>
-        </w:rPr>
-        <w:t xml:space="preserve"> </w:t>
+          <w:lang w:val="vi-VN"/>
+        </w:rPr>
+        <w:t xml:space="preserve"> hủy đăng ký lần nữa </w:t>
       </w:r>
       <w:r>
         <w:rPr>
           <w:rFonts w:ascii="Segoe UI Symbol" w:hAnsi="Segoe UI Symbol" w:cs="Segoe UI Symbol"/>
           <w:sz w:val="26"/>
           <w:szCs w:val="26"/>
+          <w:lang w:val="vi-VN"/>
         </w:rPr>
         <w:t>➔</w:t>
       </w:r>
@@ -768,62 +346,9 @@
           <w:rFonts w:ascii="Times New Roman" w:hAnsi="Times New Roman" w:cs="Times New Roman"/>
           <w:sz w:val="26"/>
           <w:szCs w:val="26"/>
-        </w:rPr>
-        <w:t xml:space="preserve"> </w:t>
-      </w:r>
-      <w:proofErr w:type="spellStart"/>
-      <w:r>
-        <w:rPr>
-          <w:rFonts w:ascii="Times New Roman" w:hAnsi="Times New Roman" w:cs="Times New Roman"/>
-          <w:sz w:val="26"/>
-          <w:szCs w:val="26"/>
-        </w:rPr>
-        <w:t>bị</w:t>
-      </w:r>
-      <w:proofErr w:type="spellEnd"/>
-      <w:r>
-        <w:rPr>
-          <w:rFonts w:ascii="Times New Roman" w:hAnsi="Times New Roman" w:cs="Times New Roman"/>
-          <w:sz w:val="26"/>
-          <w:szCs w:val="26"/>
-        </w:rPr>
-        <w:t xml:space="preserve"> </w:t>
-      </w:r>
-      <w:proofErr w:type="spellStart"/>
-      <w:r>
-        <w:rPr>
-          <w:rFonts w:ascii="Times New Roman" w:hAnsi="Times New Roman" w:cs="Times New Roman"/>
-          <w:sz w:val="26"/>
-          <w:szCs w:val="26"/>
-        </w:rPr>
-        <w:t>từ</w:t>
-      </w:r>
-      <w:proofErr w:type="spellEnd"/>
-      <w:r>
-        <w:rPr>
-          <w:rFonts w:ascii="Times New Roman" w:hAnsi="Times New Roman" w:cs="Times New Roman"/>
-          <w:sz w:val="26"/>
-          <w:szCs w:val="26"/>
-        </w:rPr>
-        <w:t xml:space="preserve"> </w:t>
-      </w:r>
-      <w:proofErr w:type="spellStart"/>
-      <w:r>
-        <w:rPr>
-          <w:rFonts w:ascii="Times New Roman" w:hAnsi="Times New Roman" w:cs="Times New Roman"/>
-          <w:sz w:val="26"/>
-          <w:szCs w:val="26"/>
-        </w:rPr>
-        <w:t>chối</w:t>
-      </w:r>
-      <w:proofErr w:type="spellEnd"/>
-      <w:r>
-        <w:rPr>
-          <w:rFonts w:ascii="Times New Roman" w:hAnsi="Times New Roman" w:cs="Times New Roman"/>
-          <w:sz w:val="26"/>
-          <w:szCs w:val="26"/>
-        </w:rPr>
-        <w:t xml:space="preserve"> </w:t>
+          <w:lang w:val="vi-VN"/>
+        </w:rPr>
+        <w:t xml:space="preserve"> bị từ chối </w:t>
       </w:r>
     </w:p>
     <w:p>
@@ -873,6 +398,7 @@
           <w:rFonts w:ascii="Times New Roman" w:hAnsi="Times New Roman" w:cs="Times New Roman"/>
           <w:sz w:val="26"/>
           <w:szCs w:val="26"/>
+          <w:lang w:val="vi-VN"/>
         </w:rPr>
       </w:pPr>
       <w:r>
@@ -880,6 +406,7 @@
           <w:rFonts w:ascii="Cambria Math" w:hAnsi="Cambria Math" w:cs="Cambria Math"/>
           <w:sz w:val="26"/>
           <w:szCs w:val="26"/>
+          <w:lang w:val="vi-VN"/>
         </w:rPr>
         <w:t>①</w:t>
       </w:r>
@@ -888,86 +415,36 @@
           <w:rFonts w:ascii="Times New Roman" w:hAnsi="Times New Roman" w:cs="Times New Roman"/>
           <w:sz w:val="26"/>
           <w:szCs w:val="26"/>
-        </w:rPr>
-        <w:t xml:space="preserve"> </w:t>
-      </w:r>
-      <w:proofErr w:type="spellStart"/>
-      <w:r>
-        <w:rPr>
-          <w:rFonts w:ascii="Times New Roman" w:hAnsi="Times New Roman" w:cs="Times New Roman"/>
-          <w:sz w:val="26"/>
-          <w:szCs w:val="26"/>
-        </w:rPr>
-        <w:t>Sự</w:t>
-      </w:r>
-      <w:proofErr w:type="spellEnd"/>
-      <w:r>
-        <w:rPr>
-          <w:rFonts w:ascii="Times New Roman" w:hAnsi="Times New Roman" w:cs="Times New Roman"/>
-          <w:sz w:val="26"/>
-          <w:szCs w:val="26"/>
-        </w:rPr>
-        <w:t xml:space="preserve"> </w:t>
-      </w:r>
-      <w:proofErr w:type="spellStart"/>
-      <w:r>
-        <w:rPr>
-          <w:rFonts w:ascii="Times New Roman" w:hAnsi="Times New Roman" w:cs="Times New Roman"/>
-          <w:sz w:val="26"/>
-          <w:szCs w:val="26"/>
-        </w:rPr>
-        <w:t>kiện</w:t>
-      </w:r>
-      <w:proofErr w:type="spellEnd"/>
-      <w:r>
-        <w:rPr>
-          <w:rFonts w:ascii="Times New Roman" w:hAnsi="Times New Roman" w:cs="Times New Roman"/>
-          <w:sz w:val="26"/>
-          <w:szCs w:val="26"/>
-        </w:rPr>
-        <w:t xml:space="preserve"> Online </w:t>
-      </w:r>
-      <w:proofErr w:type="spellStart"/>
-      <w:r>
-        <w:rPr>
-          <w:rFonts w:ascii="Times New Roman" w:hAnsi="Times New Roman" w:cs="Times New Roman"/>
-          <w:sz w:val="26"/>
-          <w:szCs w:val="26"/>
-        </w:rPr>
-        <w:t>còn</w:t>
-      </w:r>
-      <w:proofErr w:type="spellEnd"/>
-      <w:r>
-        <w:rPr>
-          <w:rFonts w:ascii="Times New Roman" w:hAnsi="Times New Roman" w:cs="Times New Roman"/>
-          <w:sz w:val="26"/>
-          <w:szCs w:val="26"/>
-        </w:rPr>
-        <w:t xml:space="preserve"> </w:t>
-      </w:r>
-      <w:proofErr w:type="spellStart"/>
-      <w:r>
-        <w:rPr>
-          <w:rFonts w:ascii="Times New Roman" w:hAnsi="Times New Roman" w:cs="Times New Roman"/>
-          <w:sz w:val="26"/>
-          <w:szCs w:val="26"/>
-        </w:rPr>
-        <w:t>chỗ</w:t>
-      </w:r>
-      <w:proofErr w:type="spellEnd"/>
-      <w:r>
-        <w:rPr>
-          <w:rFonts w:ascii="Times New Roman" w:hAnsi="Times New Roman" w:cs="Times New Roman"/>
-          <w:sz w:val="26"/>
-          <w:szCs w:val="26"/>
-        </w:rPr>
-        <w:t xml:space="preserve"> </w:t>
+          <w:lang w:val="vi-VN"/>
+        </w:rPr>
+        <w:t xml:space="preserve"> Sự kiện </w:t>
+      </w:r>
+      <w:proofErr w:type="spellStart"/>
+      <w:r>
+        <w:rPr>
+          <w:rFonts w:ascii="Times New Roman" w:hAnsi="Times New Roman" w:cs="Times New Roman"/>
+          <w:sz w:val="26"/>
+          <w:szCs w:val="26"/>
+          <w:lang w:val="vi-VN"/>
+        </w:rPr>
+        <w:t>Online</w:t>
+      </w:r>
+      <w:proofErr w:type="spellEnd"/>
+      <w:r>
+        <w:rPr>
+          <w:rFonts w:ascii="Times New Roman" w:hAnsi="Times New Roman" w:cs="Times New Roman"/>
+          <w:sz w:val="26"/>
+          <w:szCs w:val="26"/>
+          <w:lang w:val="vi-VN"/>
+        </w:rPr>
+        <w:t xml:space="preserve"> còn chỗ </w:t>
       </w:r>
       <w:r>
         <w:rPr>
           <w:rFonts w:ascii="Segoe UI Symbol" w:hAnsi="Segoe UI Symbol" w:cs="Segoe UI Symbol"/>
           <w:sz w:val="26"/>
           <w:szCs w:val="26"/>
+          <w:lang w:val="vi-VN"/>
         </w:rPr>
         <w:t>➔</w:t>
       </w:r>
@@ -976,50 +453,16 @@
           <w:rFonts w:ascii="Times New Roman" w:hAnsi="Times New Roman" w:cs="Times New Roman"/>
           <w:sz w:val="26"/>
           <w:szCs w:val="26"/>
-        </w:rPr>
-        <w:t xml:space="preserve"> </w:t>
-      </w:r>
-      <w:proofErr w:type="spellStart"/>
-      <w:r>
-        <w:rPr>
-          <w:rFonts w:ascii="Times New Roman" w:hAnsi="Times New Roman" w:cs="Times New Roman"/>
-          <w:sz w:val="26"/>
-          <w:szCs w:val="26"/>
-        </w:rPr>
-        <w:t>đăng</w:t>
-      </w:r>
-      <w:proofErr w:type="spellEnd"/>
-      <w:r>
-        <w:rPr>
-          <w:rFonts w:ascii="Times New Roman" w:hAnsi="Times New Roman" w:cs="Times New Roman"/>
-          <w:sz w:val="26"/>
-          <w:szCs w:val="26"/>
-        </w:rPr>
-        <w:t xml:space="preserve"> </w:t>
-      </w:r>
-      <w:proofErr w:type="spellStart"/>
-      <w:r>
-        <w:rPr>
-          <w:rFonts w:ascii="Times New Roman" w:hAnsi="Times New Roman" w:cs="Times New Roman"/>
-          <w:sz w:val="26"/>
-          <w:szCs w:val="26"/>
-        </w:rPr>
-        <w:t>ký</w:t>
-      </w:r>
-      <w:proofErr w:type="spellEnd"/>
-      <w:r>
-        <w:rPr>
-          <w:rFonts w:ascii="Times New Roman" w:hAnsi="Times New Roman" w:cs="Times New Roman"/>
-          <w:sz w:val="26"/>
-          <w:szCs w:val="26"/>
-        </w:rPr>
-        <w:t xml:space="preserve"> </w:t>
+          <w:lang w:val="vi-VN"/>
+        </w:rPr>
+        <w:t xml:space="preserve"> đăng ký </w:t>
       </w:r>
       <w:r>
         <w:rPr>
           <w:rFonts w:ascii="Segoe UI Symbol" w:hAnsi="Segoe UI Symbol" w:cs="Segoe UI Symbol"/>
           <w:sz w:val="26"/>
           <w:szCs w:val="26"/>
+          <w:lang w:val="vi-VN"/>
         </w:rPr>
         <w:t>➔</w:t>
       </w:r>
@@ -1028,98 +471,49 @@
           <w:rFonts w:ascii="Times New Roman" w:hAnsi="Times New Roman" w:cs="Times New Roman"/>
           <w:sz w:val="26"/>
           <w:szCs w:val="26"/>
-        </w:rPr>
-        <w:t xml:space="preserve"> </w:t>
-      </w:r>
-      <w:proofErr w:type="spellStart"/>
-      <w:r>
-        <w:rPr>
-          <w:rFonts w:ascii="Times New Roman" w:hAnsi="Times New Roman" w:cs="Times New Roman"/>
-          <w:sz w:val="26"/>
-          <w:szCs w:val="26"/>
-        </w:rPr>
-        <w:t>tạo</w:t>
-      </w:r>
-      <w:proofErr w:type="spellEnd"/>
-      <w:r>
-        <w:rPr>
-          <w:rFonts w:ascii="Times New Roman" w:hAnsi="Times New Roman" w:cs="Times New Roman"/>
-          <w:sz w:val="26"/>
-          <w:szCs w:val="26"/>
-        </w:rPr>
-        <w:t xml:space="preserve"> </w:t>
-      </w:r>
-      <w:proofErr w:type="spellStart"/>
-      <w:r>
-        <w:rPr>
-          <w:rFonts w:ascii="Times New Roman" w:hAnsi="Times New Roman" w:cs="Times New Roman"/>
-          <w:sz w:val="26"/>
-          <w:szCs w:val="26"/>
-        </w:rPr>
-        <w:t>phiếu</w:t>
-      </w:r>
-      <w:proofErr w:type="spellEnd"/>
-      <w:r>
-        <w:rPr>
-          <w:rFonts w:ascii="Times New Roman" w:hAnsi="Times New Roman" w:cs="Times New Roman"/>
-          <w:sz w:val="26"/>
-          <w:szCs w:val="26"/>
-        </w:rPr>
-        <w:t xml:space="preserve"> Registration (Pending = </w:t>
-      </w:r>
-      <w:proofErr w:type="spellStart"/>
-      <w:r>
-        <w:rPr>
-          <w:rFonts w:ascii="Times New Roman" w:hAnsi="Times New Roman" w:cs="Times New Roman"/>
-          <w:sz w:val="26"/>
-          <w:szCs w:val="26"/>
-        </w:rPr>
-        <w:t>chờ</w:t>
-      </w:r>
-      <w:proofErr w:type="spellEnd"/>
-      <w:r>
-        <w:rPr>
-          <w:rFonts w:ascii="Times New Roman" w:hAnsi="Times New Roman" w:cs="Times New Roman"/>
-          <w:sz w:val="26"/>
-          <w:szCs w:val="26"/>
-        </w:rPr>
-        <w:t xml:space="preserve"> </w:t>
-      </w:r>
-      <w:proofErr w:type="spellStart"/>
-      <w:r>
-        <w:rPr>
-          <w:rFonts w:ascii="Times New Roman" w:hAnsi="Times New Roman" w:cs="Times New Roman"/>
-          <w:sz w:val="26"/>
-          <w:szCs w:val="26"/>
-        </w:rPr>
-        <w:t>xác</w:t>
-      </w:r>
-      <w:proofErr w:type="spellEnd"/>
-      <w:r>
-        <w:rPr>
-          <w:rFonts w:ascii="Times New Roman" w:hAnsi="Times New Roman" w:cs="Times New Roman"/>
-          <w:sz w:val="26"/>
-          <w:szCs w:val="26"/>
-        </w:rPr>
-        <w:t xml:space="preserve"> </w:t>
-      </w:r>
-      <w:proofErr w:type="spellStart"/>
-      <w:r>
-        <w:rPr>
-          <w:rFonts w:ascii="Times New Roman" w:hAnsi="Times New Roman" w:cs="Times New Roman"/>
-          <w:sz w:val="26"/>
-          <w:szCs w:val="26"/>
-        </w:rPr>
-        <w:t>nhận</w:t>
-      </w:r>
-      <w:proofErr w:type="spellEnd"/>
-      <w:r>
-        <w:rPr>
-          <w:rFonts w:ascii="Times New Roman" w:hAnsi="Times New Roman" w:cs="Times New Roman"/>
-          <w:sz w:val="26"/>
-          <w:szCs w:val="26"/>
-        </w:rPr>
-        <w:t>)</w:t>
+          <w:lang w:val="vi-VN"/>
+        </w:rPr>
+        <w:t xml:space="preserve"> tạo phiếu </w:t>
+      </w:r>
+      <w:proofErr w:type="spellStart"/>
+      <w:r>
+        <w:rPr>
+          <w:rFonts w:ascii="Times New Roman" w:hAnsi="Times New Roman" w:cs="Times New Roman"/>
+          <w:sz w:val="26"/>
+          <w:szCs w:val="26"/>
+          <w:lang w:val="vi-VN"/>
+        </w:rPr>
+        <w:t>Registration</w:t>
+      </w:r>
+      <w:proofErr w:type="spellEnd"/>
+      <w:r>
+        <w:rPr>
+          <w:rFonts w:ascii="Times New Roman" w:hAnsi="Times New Roman" w:cs="Times New Roman"/>
+          <w:sz w:val="26"/>
+          <w:szCs w:val="26"/>
+          <w:lang w:val="vi-VN"/>
+        </w:rPr>
+        <w:t xml:space="preserve"> (</w:t>
+      </w:r>
+      <w:proofErr w:type="spellStart"/>
+      <w:r>
+        <w:rPr>
+          <w:rFonts w:ascii="Times New Roman" w:hAnsi="Times New Roman" w:cs="Times New Roman"/>
+          <w:sz w:val="26"/>
+          <w:szCs w:val="26"/>
+          <w:lang w:val="vi-VN"/>
+        </w:rPr>
+        <w:t>Pending</w:t>
+      </w:r>
+      <w:proofErr w:type="spellEnd"/>
+      <w:r>
+        <w:rPr>
+          <w:rFonts w:ascii="Times New Roman" w:hAnsi="Times New Roman" w:cs="Times New Roman"/>
+          <w:sz w:val="26"/>
+          <w:szCs w:val="26"/>
+          <w:lang w:val="vi-VN"/>
+        </w:rPr>
+        <w:t xml:space="preserve"> = chờ xác nhận)</w:t>
       </w:r>
     </w:p>
     <w:p>
@@ -1137,6 +531,7 @@
           <w:rFonts w:ascii="Cambria Math" w:hAnsi="Cambria Math" w:cs="Cambria Math"/>
           <w:sz w:val="26"/>
           <w:szCs w:val="26"/>
+          <w:lang w:val="vi-VN"/>
         </w:rPr>
         <w:t>②</w:t>
       </w:r>
@@ -1145,104 +540,56 @@
           <w:rFonts w:ascii="Times New Roman" w:hAnsi="Times New Roman" w:cs="Times New Roman"/>
           <w:sz w:val="26"/>
           <w:szCs w:val="26"/>
-        </w:rPr>
-        <w:t xml:space="preserve"> </w:t>
-      </w:r>
-      <w:proofErr w:type="spellStart"/>
-      <w:r>
-        <w:rPr>
-          <w:rFonts w:ascii="Times New Roman" w:hAnsi="Times New Roman" w:cs="Times New Roman"/>
-          <w:sz w:val="26"/>
-          <w:szCs w:val="26"/>
-        </w:rPr>
-        <w:t>Sự</w:t>
-      </w:r>
-      <w:proofErr w:type="spellEnd"/>
-      <w:r>
-        <w:rPr>
-          <w:rFonts w:ascii="Times New Roman" w:hAnsi="Times New Roman" w:cs="Times New Roman"/>
-          <w:sz w:val="26"/>
-          <w:szCs w:val="26"/>
-        </w:rPr>
-        <w:t xml:space="preserve"> </w:t>
-      </w:r>
-      <w:proofErr w:type="spellStart"/>
-      <w:r>
-        <w:rPr>
-          <w:rFonts w:ascii="Times New Roman" w:hAnsi="Times New Roman" w:cs="Times New Roman"/>
-          <w:sz w:val="26"/>
-          <w:szCs w:val="26"/>
-        </w:rPr>
-        <w:t>kiện</w:t>
-      </w:r>
-      <w:proofErr w:type="spellEnd"/>
-      <w:r>
-        <w:rPr>
-          <w:rFonts w:ascii="Times New Roman" w:hAnsi="Times New Roman" w:cs="Times New Roman"/>
-          <w:sz w:val="26"/>
-          <w:szCs w:val="26"/>
-        </w:rPr>
-        <w:t xml:space="preserve"> Online </w:t>
-      </w:r>
-      <w:proofErr w:type="spellStart"/>
-      <w:r>
-        <w:rPr>
-          <w:rFonts w:ascii="Times New Roman" w:hAnsi="Times New Roman" w:cs="Times New Roman"/>
-          <w:sz w:val="26"/>
-          <w:szCs w:val="26"/>
-        </w:rPr>
-        <w:t>hết</w:t>
-      </w:r>
-      <w:proofErr w:type="spellEnd"/>
-      <w:r>
-        <w:rPr>
-          <w:rFonts w:ascii="Times New Roman" w:hAnsi="Times New Roman" w:cs="Times New Roman"/>
-          <w:sz w:val="26"/>
-          <w:szCs w:val="26"/>
-        </w:rPr>
-        <w:t xml:space="preserve"> </w:t>
-      </w:r>
-      <w:proofErr w:type="spellStart"/>
-      <w:r>
-        <w:rPr>
-          <w:rFonts w:ascii="Times New Roman" w:hAnsi="Times New Roman" w:cs="Times New Roman"/>
-          <w:sz w:val="26"/>
-          <w:szCs w:val="26"/>
-        </w:rPr>
-        <w:t>chỗ</w:t>
-      </w:r>
-      <w:proofErr w:type="spellEnd"/>
-      <w:r>
-        <w:rPr>
-          <w:rFonts w:ascii="Times New Roman" w:hAnsi="Times New Roman" w:cs="Times New Roman"/>
-          <w:sz w:val="26"/>
-          <w:szCs w:val="26"/>
-        </w:rPr>
-        <w:t xml:space="preserve"> (</w:t>
-      </w:r>
-      <w:proofErr w:type="spellStart"/>
-      <w:r>
-        <w:rPr>
-          <w:rFonts w:ascii="Times New Roman" w:hAnsi="Times New Roman" w:cs="Times New Roman"/>
-          <w:sz w:val="26"/>
-          <w:szCs w:val="26"/>
-        </w:rPr>
-        <w:t>đủ</w:t>
-      </w:r>
-      <w:proofErr w:type="spellEnd"/>
-      <w:r>
-        <w:rPr>
-          <w:rFonts w:ascii="Times New Roman" w:hAnsi="Times New Roman" w:cs="Times New Roman"/>
-          <w:sz w:val="26"/>
-          <w:szCs w:val="26"/>
-        </w:rPr>
-        <w:t xml:space="preserve"> Capacity) </w:t>
+          <w:lang w:val="vi-VN"/>
+        </w:rPr>
+        <w:t xml:space="preserve"> Sự kiện </w:t>
+      </w:r>
+      <w:proofErr w:type="spellStart"/>
+      <w:r>
+        <w:rPr>
+          <w:rFonts w:ascii="Times New Roman" w:hAnsi="Times New Roman" w:cs="Times New Roman"/>
+          <w:sz w:val="26"/>
+          <w:szCs w:val="26"/>
+          <w:lang w:val="vi-VN"/>
+        </w:rPr>
+        <w:t>Online</w:t>
+      </w:r>
+      <w:proofErr w:type="spellEnd"/>
+      <w:r>
+        <w:rPr>
+          <w:rFonts w:ascii="Times New Roman" w:hAnsi="Times New Roman" w:cs="Times New Roman"/>
+          <w:sz w:val="26"/>
+          <w:szCs w:val="26"/>
+          <w:lang w:val="vi-VN"/>
+        </w:rPr>
+        <w:t xml:space="preserve"> hết chỗ (đủ </w:t>
+      </w:r>
+      <w:proofErr w:type="spellStart"/>
+      <w:r>
+        <w:rPr>
+          <w:rFonts w:ascii="Times New Roman" w:hAnsi="Times New Roman" w:cs="Times New Roman"/>
+          <w:sz w:val="26"/>
+          <w:szCs w:val="26"/>
+          <w:lang w:val="vi-VN"/>
+        </w:rPr>
+        <w:t>Capacity</w:t>
+      </w:r>
+      <w:proofErr w:type="spellEnd"/>
+      <w:r>
+        <w:rPr>
+          <w:rFonts w:ascii="Times New Roman" w:hAnsi="Times New Roman" w:cs="Times New Roman"/>
+          <w:sz w:val="26"/>
+          <w:szCs w:val="26"/>
+          <w:lang w:val="vi-VN"/>
+        </w:rPr>
+        <w:t xml:space="preserve">) </w:t>
       </w:r>
       <w:r>
         <w:rPr>
           <w:rFonts w:ascii="Segoe UI Symbol" w:hAnsi="Segoe UI Symbol" w:cs="Segoe UI Symbol"/>
           <w:sz w:val="26"/>
           <w:szCs w:val="26"/>
+          <w:lang w:val="vi-VN"/>
         </w:rPr>
         <w:t>➔</w:t>
       </w:r>
@@ -1251,50 +598,16 @@
           <w:rFonts w:ascii="Times New Roman" w:hAnsi="Times New Roman" w:cs="Times New Roman"/>
           <w:sz w:val="26"/>
           <w:szCs w:val="26"/>
-        </w:rPr>
-        <w:t xml:space="preserve"> </w:t>
-      </w:r>
-      <w:proofErr w:type="spellStart"/>
-      <w:r>
-        <w:rPr>
-          <w:rFonts w:ascii="Times New Roman" w:hAnsi="Times New Roman" w:cs="Times New Roman"/>
-          <w:sz w:val="26"/>
-          <w:szCs w:val="26"/>
-        </w:rPr>
-        <w:t>đăng</w:t>
-      </w:r>
-      <w:proofErr w:type="spellEnd"/>
-      <w:r>
-        <w:rPr>
-          <w:rFonts w:ascii="Times New Roman" w:hAnsi="Times New Roman" w:cs="Times New Roman"/>
-          <w:sz w:val="26"/>
-          <w:szCs w:val="26"/>
-        </w:rPr>
-        <w:t xml:space="preserve"> </w:t>
-      </w:r>
-      <w:proofErr w:type="spellStart"/>
-      <w:r>
-        <w:rPr>
-          <w:rFonts w:ascii="Times New Roman" w:hAnsi="Times New Roman" w:cs="Times New Roman"/>
-          <w:sz w:val="26"/>
-          <w:szCs w:val="26"/>
-        </w:rPr>
-        <w:t>ký</w:t>
-      </w:r>
-      <w:proofErr w:type="spellEnd"/>
-      <w:r>
-        <w:rPr>
-          <w:rFonts w:ascii="Times New Roman" w:hAnsi="Times New Roman" w:cs="Times New Roman"/>
-          <w:sz w:val="26"/>
-          <w:szCs w:val="26"/>
-        </w:rPr>
-        <w:t xml:space="preserve"> </w:t>
+          <w:lang w:val="vi-VN"/>
+        </w:rPr>
+        <w:t xml:space="preserve"> đăng ký </w:t>
       </w:r>
       <w:r>
         <w:rPr>
           <w:rFonts w:ascii="Segoe UI Symbol" w:hAnsi="Segoe UI Symbol" w:cs="Segoe UI Symbol"/>
           <w:sz w:val="26"/>
           <w:szCs w:val="26"/>
+          <w:lang w:val="vi-VN"/>
         </w:rPr>
         <w:t>➔</w:t>
       </w:r>
@@ -1303,127 +616,10 @@
           <w:rFonts w:ascii="Times New Roman" w:hAnsi="Times New Roman" w:cs="Times New Roman"/>
           <w:sz w:val="26"/>
           <w:szCs w:val="26"/>
-        </w:rPr>
-        <w:t xml:space="preserve"> </w:t>
-      </w:r>
-      <w:proofErr w:type="spellStart"/>
-      <w:r>
-        <w:rPr>
-          <w:rFonts w:ascii="Times New Roman" w:hAnsi="Times New Roman" w:cs="Times New Roman"/>
-          <w:sz w:val="26"/>
-          <w:szCs w:val="26"/>
-        </w:rPr>
-        <w:t>báo</w:t>
-      </w:r>
-      <w:proofErr w:type="spellEnd"/>
-      <w:r>
-        <w:rPr>
-          <w:rFonts w:ascii="Times New Roman" w:hAnsi="Times New Roman" w:cs="Times New Roman"/>
-          <w:sz w:val="26"/>
-          <w:szCs w:val="26"/>
-        </w:rPr>
-        <w:t xml:space="preserve"> </w:t>
-      </w:r>
-      <w:proofErr w:type="spellStart"/>
-      <w:r>
-        <w:rPr>
-          <w:rFonts w:ascii="Times New Roman" w:hAnsi="Times New Roman" w:cs="Times New Roman"/>
-          <w:sz w:val="26"/>
-          <w:szCs w:val="26"/>
-        </w:rPr>
-        <w:t>lỗi</w:t>
-      </w:r>
-      <w:proofErr w:type="spellEnd"/>
-      <w:r>
-        <w:rPr>
-          <w:rFonts w:ascii="Times New Roman" w:hAnsi="Times New Roman" w:cs="Times New Roman"/>
-          <w:sz w:val="26"/>
-          <w:szCs w:val="26"/>
-        </w:rPr>
-        <w:t xml:space="preserve"> </w:t>
-      </w:r>
-      <w:proofErr w:type="spellStart"/>
-      <w:r>
-        <w:rPr>
-          <w:rFonts w:ascii="Times New Roman" w:hAnsi="Times New Roman" w:cs="Times New Roman"/>
-          <w:sz w:val="26"/>
-          <w:szCs w:val="26"/>
-        </w:rPr>
-        <w:t>sự</w:t>
-      </w:r>
-      <w:proofErr w:type="spellEnd"/>
-      <w:r>
-        <w:rPr>
-          <w:rFonts w:ascii="Times New Roman" w:hAnsi="Times New Roman" w:cs="Times New Roman"/>
-          <w:sz w:val="26"/>
-          <w:szCs w:val="26"/>
-        </w:rPr>
-        <w:t xml:space="preserve"> </w:t>
-      </w:r>
-      <w:proofErr w:type="spellStart"/>
-      <w:r>
-        <w:rPr>
-          <w:rFonts w:ascii="Times New Roman" w:hAnsi="Times New Roman" w:cs="Times New Roman"/>
-          <w:sz w:val="26"/>
-          <w:szCs w:val="26"/>
-        </w:rPr>
-        <w:t>kiện</w:t>
-      </w:r>
-      <w:proofErr w:type="spellEnd"/>
-      <w:r>
-        <w:rPr>
-          <w:rFonts w:ascii="Times New Roman" w:hAnsi="Times New Roman" w:cs="Times New Roman"/>
-          <w:sz w:val="26"/>
-          <w:szCs w:val="26"/>
-        </w:rPr>
-        <w:t xml:space="preserve"> </w:t>
-      </w:r>
-      <w:proofErr w:type="spellStart"/>
-      <w:r>
-        <w:rPr>
-          <w:rFonts w:ascii="Times New Roman" w:hAnsi="Times New Roman" w:cs="Times New Roman"/>
-          <w:sz w:val="26"/>
-          <w:szCs w:val="26"/>
-        </w:rPr>
-        <w:t>đã</w:t>
-      </w:r>
-      <w:proofErr w:type="spellEnd"/>
-      <w:r>
-        <w:rPr>
-          <w:rFonts w:ascii="Times New Roman" w:hAnsi="Times New Roman" w:cs="Times New Roman"/>
-          <w:sz w:val="26"/>
-          <w:szCs w:val="26"/>
-        </w:rPr>
-        <w:t xml:space="preserve"> </w:t>
-      </w:r>
-      <w:proofErr w:type="spellStart"/>
-      <w:r>
-        <w:rPr>
-          <w:rFonts w:ascii="Times New Roman" w:hAnsi="Times New Roman" w:cs="Times New Roman"/>
-          <w:sz w:val="26"/>
-          <w:szCs w:val="26"/>
-        </w:rPr>
-        <w:t>hết</w:t>
-      </w:r>
-      <w:proofErr w:type="spellEnd"/>
-      <w:r>
-        <w:rPr>
-          <w:rFonts w:ascii="Times New Roman" w:hAnsi="Times New Roman" w:cs="Times New Roman"/>
-          <w:sz w:val="26"/>
-          <w:szCs w:val="26"/>
-        </w:rPr>
-        <w:t xml:space="preserve"> </w:t>
-      </w:r>
-      <w:proofErr w:type="spellStart"/>
-      <w:r>
-        <w:rPr>
-          <w:rFonts w:ascii="Times New Roman" w:hAnsi="Times New Roman" w:cs="Times New Roman"/>
-          <w:sz w:val="26"/>
-          <w:szCs w:val="26"/>
-        </w:rPr>
-        <w:t>chỗ</w:t>
-      </w:r>
-      <w:proofErr w:type="spellEnd"/>
+          <w:lang w:val="vi-VN"/>
+        </w:rPr>
+        <w:t xml:space="preserve"> báo lỗi sự kiện đã hết chỗ</w:t>
+      </w:r>
     </w:p>
     <w:p>
       <w:pPr>
@@ -1440,8 +636,17 @@
           <w:rFonts w:ascii="Times New Roman" w:hAnsi="Times New Roman" w:cs="Times New Roman"/>
           <w:sz w:val="26"/>
           <w:szCs w:val="26"/>
-        </w:rPr>
-        <w:t xml:space="preserve"> 2. Ban CLB (Club Board)</w:t>
+          <w:lang w:val="vi-VN"/>
+        </w:rPr>
+        <w:t xml:space="preserve"> </w:t>
+      </w:r>
+      <w:r>
+        <w:rPr>
+          <w:rFonts w:ascii="Times New Roman" w:hAnsi="Times New Roman" w:cs="Times New Roman"/>
+          <w:sz w:val="26"/>
+          <w:szCs w:val="26"/>
+        </w:rPr>
+        <w:t>2. Ban CLB (Club Board)</w:t>
       </w:r>
     </w:p>
     <w:p>
@@ -1799,25 +1004,7 @@
           <w:sz w:val="26"/>
           <w:szCs w:val="26"/>
         </w:rPr>
-        <w:t xml:space="preserve"> </w:t>
-      </w:r>
-      <w:proofErr w:type="gramStart"/>
-      <w:r>
-        <w:rPr>
-          <w:rFonts w:ascii="Times New Roman" w:hAnsi="Times New Roman" w:cs="Times New Roman"/>
-          <w:sz w:val="26"/>
-          <w:szCs w:val="26"/>
-        </w:rPr>
-        <w:t>Confirm(</w:t>
-      </w:r>
-      <w:proofErr w:type="gramEnd"/>
-      <w:r>
-        <w:rPr>
-          <w:rFonts w:ascii="Times New Roman" w:hAnsi="Times New Roman" w:cs="Times New Roman"/>
-          <w:sz w:val="26"/>
-          <w:szCs w:val="26"/>
-        </w:rPr>
-        <w:t xml:space="preserve">) </w:t>
+        <w:t xml:space="preserve"> Confirm() </w:t>
       </w:r>
       <w:r>
         <w:rPr>
@@ -3341,7 +2528,6 @@
         <w:t xml:space="preserve"> </w:t>
       </w:r>
       <w:proofErr w:type="spellStart"/>
-      <w:proofErr w:type="gramStart"/>
       <w:r>
         <w:rPr>
           <w:rFonts w:ascii="Times New Roman" w:hAnsi="Times New Roman" w:cs="Times New Roman"/>
@@ -3357,16 +2543,7 @@
           <w:sz w:val="26"/>
           <w:szCs w:val="26"/>
         </w:rPr>
-        <w:t>(</w:t>
-      </w:r>
-      <w:proofErr w:type="gramEnd"/>
-      <w:r>
-        <w:rPr>
-          <w:rFonts w:ascii="Times New Roman" w:hAnsi="Times New Roman" w:cs="Times New Roman"/>
-          <w:sz w:val="26"/>
-          <w:szCs w:val="26"/>
-        </w:rPr>
-        <w:t>) = true</w:t>
+        <w:t>() = true</w:t>
       </w:r>
     </w:p>
     <w:p>
@@ -3767,7 +2944,25 @@
           <w:sz w:val="26"/>
           <w:szCs w:val="26"/>
         </w:rPr>
-        <w:t xml:space="preserve"> động"</w:t>
+        <w:t xml:space="preserve"> </w:t>
+      </w:r>
+      <w:proofErr w:type="spellStart"/>
+      <w:r>
+        <w:rPr>
+          <w:rFonts w:ascii="Times New Roman" w:hAnsi="Times New Roman" w:cs="Times New Roman"/>
+          <w:sz w:val="26"/>
+          <w:szCs w:val="26"/>
+        </w:rPr>
+        <w:t>động</w:t>
+      </w:r>
+      <w:proofErr w:type="spellEnd"/>
+      <w:r>
+        <w:rPr>
+          <w:rFonts w:ascii="Times New Roman" w:hAnsi="Times New Roman" w:cs="Times New Roman"/>
+          <w:sz w:val="26"/>
+          <w:szCs w:val="26"/>
+        </w:rPr>
+        <w:t>"</w:t>
       </w:r>
     </w:p>
     <w:p>
@@ -4523,25 +3718,7 @@
           <w:sz w:val="26"/>
           <w:szCs w:val="26"/>
         </w:rPr>
-        <w:t xml:space="preserve"> </w:t>
-      </w:r>
-      <w:proofErr w:type="spellStart"/>
-      <w:r>
-        <w:rPr>
-          <w:rFonts w:ascii="Times New Roman" w:hAnsi="Times New Roman" w:cs="Times New Roman"/>
-          <w:sz w:val="26"/>
-          <w:szCs w:val="26"/>
-        </w:rPr>
-        <w:t>viên</w:t>
-      </w:r>
-      <w:proofErr w:type="spellEnd"/>
-      <w:r>
-        <w:rPr>
-          <w:rFonts w:ascii="Times New Roman" w:hAnsi="Times New Roman" w:cs="Times New Roman"/>
-          <w:sz w:val="26"/>
-          <w:szCs w:val="26"/>
-        </w:rPr>
-        <w:t>)</w:t>
+        <w:t xml:space="preserve"> viên)</w:t>
       </w:r>
     </w:p>
     <w:p>
@@ -5167,6 +4344,7 @@
   <w:style w:type="character" w:default="1" w:styleId="DefaultParagraphFont">
     <w:name w:val="Default Paragraph Font"/>
     <w:uiPriority w:val="1"/>
+    <w:semiHidden/>
     <w:unhideWhenUsed/>
   </w:style>
   <w:style w:type="table" w:default="1" w:styleId="TableNormal">

</xml_diff>